<commit_message>
Add cultural and circular-economy programme
</commit_message>
<xml_diff>
--- a/static/downloads/proposta-benet-corner.docx
+++ b/static/downloads/proposta-benet-corner.docx
@@ -369,6 +369,7 @@
     </w:p>
     <w:p>
       <w:pPr>
+        <w:keepLines/>
         <w:numPr>
           <w:ilvl w:val="0"/>
           <w:numId w:val="11"/>
@@ -396,6 +397,7 @@
     </w:p>
     <w:p>
       <w:pPr>
+        <w:keepLines/>
         <w:numPr>
           <w:ilvl w:val="0"/>
           <w:numId w:val="11"/>
@@ -423,6 +425,7 @@
     </w:p>
     <w:p>
       <w:pPr>
+        <w:keepLines/>
         <w:numPr>
           <w:ilvl w:val="0"/>
           <w:numId w:val="11"/>
@@ -450,6 +453,7 @@
     </w:p>
     <w:p>
       <w:pPr>
+        <w:keepLines/>
         <w:numPr>
           <w:ilvl w:val="0"/>
           <w:numId w:val="11"/>
@@ -477,6 +481,7 @@
     </w:p>
     <w:p>
       <w:pPr>
+        <w:keepLines/>
         <w:numPr>
           <w:ilvl w:val="0"/>
           <w:numId w:val="11"/>
@@ -519,6 +524,7 @@
     </w:p>
     <w:p>
       <w:pPr>
+        <w:keepLines/>
         <w:numPr>
           <w:ilvl w:val="0"/>
           <w:numId w:val="10"/>
@@ -546,6 +552,7 @@
     </w:p>
     <w:p>
       <w:pPr>
+        <w:keepLines/>
         <w:numPr>
           <w:ilvl w:val="0"/>
           <w:numId w:val="10"/>
@@ -573,6 +580,7 @@
     </w:p>
     <w:p>
       <w:pPr>
+        <w:keepLines/>
         <w:numPr>
           <w:ilvl w:val="0"/>
           <w:numId w:val="10"/>
@@ -600,6 +608,7 @@
     </w:p>
     <w:p>
       <w:pPr>
+        <w:keepLines/>
         <w:numPr>
           <w:ilvl w:val="0"/>
           <w:numId w:val="10"/>
@@ -627,6 +636,7 @@
     </w:p>
     <w:p>
       <w:pPr>
+        <w:keepLines/>
         <w:numPr>
           <w:ilvl w:val="0"/>
           <w:numId w:val="10"/>
@@ -654,6 +664,7 @@
     </w:p>
     <w:p>
       <w:pPr>
+        <w:keepLines/>
         <w:numPr>
           <w:ilvl w:val="0"/>
           <w:numId w:val="10"/>
@@ -681,6 +692,7 @@
     </w:p>
     <w:p>
       <w:pPr>
+        <w:keepLines/>
         <w:numPr>
           <w:ilvl w:val="0"/>
           <w:numId w:val="10"/>
@@ -738,6 +750,7 @@
     </w:p>
     <w:p>
       <w:pPr>
+        <w:keepLines/>
         <w:numPr>
           <w:ilvl w:val="0"/>
           <w:numId w:val="10"/>
@@ -756,6 +769,7 @@
     </w:p>
     <w:p>
       <w:pPr>
+        <w:keepLines/>
         <w:numPr>
           <w:ilvl w:val="0"/>
           <w:numId w:val="10"/>
@@ -774,6 +788,7 @@
     </w:p>
     <w:p>
       <w:pPr>
+        <w:keepLines/>
         <w:numPr>
           <w:ilvl w:val="0"/>
           <w:numId w:val="10"/>
@@ -792,6 +807,7 @@
     </w:p>
     <w:p>
       <w:pPr>
+        <w:keepLines/>
         <w:numPr>
           <w:ilvl w:val="0"/>
           <w:numId w:val="10"/>
@@ -810,6 +826,7 @@
     </w:p>
     <w:p>
       <w:pPr>
+        <w:keepLines/>
         <w:numPr>
           <w:ilvl w:val="0"/>
           <w:numId w:val="10"/>
@@ -843,6 +860,7 @@
     </w:p>
     <w:p>
       <w:pPr>
+        <w:keepLines/>
         <w:numPr>
           <w:ilvl w:val="0"/>
           <w:numId w:val="10"/>
@@ -861,6 +879,7 @@
     </w:p>
     <w:p>
       <w:pPr>
+        <w:keepLines/>
         <w:numPr>
           <w:ilvl w:val="0"/>
           <w:numId w:val="10"/>
@@ -879,6 +898,7 @@
     </w:p>
     <w:p>
       <w:pPr>
+        <w:keepLines/>
         <w:numPr>
           <w:ilvl w:val="0"/>
           <w:numId w:val="10"/>
@@ -897,6 +917,7 @@
     </w:p>
     <w:p>
       <w:pPr>
+        <w:keepLines/>
         <w:numPr>
           <w:ilvl w:val="0"/>
           <w:numId w:val="10"/>
@@ -930,6 +951,7 @@
     </w:p>
     <w:p>
       <w:pPr>
+        <w:keepLines/>
         <w:numPr>
           <w:ilvl w:val="0"/>
           <w:numId w:val="10"/>
@@ -948,6 +970,7 @@
     </w:p>
     <w:p>
       <w:pPr>
+        <w:keepLines/>
         <w:numPr>
           <w:ilvl w:val="0"/>
           <w:numId w:val="10"/>
@@ -966,6 +989,7 @@
     </w:p>
     <w:p>
       <w:pPr>
+        <w:keepLines/>
         <w:numPr>
           <w:ilvl w:val="0"/>
           <w:numId w:val="10"/>
@@ -984,6 +1008,7 @@
     </w:p>
     <w:p>
       <w:pPr>
+        <w:keepLines/>
         <w:numPr>
           <w:ilvl w:val="0"/>
           <w:numId w:val="10"/>
@@ -1002,6 +1027,7 @@
     </w:p>
     <w:p>
       <w:pPr>
+        <w:keepLines/>
         <w:numPr>
           <w:ilvl w:val="0"/>
           <w:numId w:val="10"/>
@@ -1030,7 +1056,218 @@
           <w:color w:val="245A7A"/>
           <w:sz w:val="25"/>
         </w:rPr>
-        <w:t>4.4 Responsabilitat social corporativa</w:t>
+        <w:t>4.4 Cultura de proximitat i arts comunitàries</w:t>
+      </w:r>
+    </w:p>
+    <w:p>
+      <w:r>
+        <w:rPr>
+          <w:rFonts w:ascii="Calibri" w:hAnsi="Calibri"/>
+          <w:color w:val="1C2428"/>
+          <w:sz w:val="21"/>
+        </w:rPr>
+        <w:t>El pavelló i el jardí acolliran una programació cultural de petita escala vinculada al barri, la memòria del Rec Comtal i la transició ecològica:</w:t>
+      </w:r>
+    </w:p>
+    <w:p>
+      <w:pPr>
+        <w:keepLines/>
+        <w:numPr>
+          <w:ilvl w:val="0"/>
+          <w:numId w:val="10"/>
+        </w:numPr>
+        <w:spacing w:after="60" w:line="283" w:lineRule="auto"/>
+        <w:jc w:val="left"/>
+      </w:pPr>
+      <w:r>
+        <w:rPr>
+          <w:rFonts w:ascii="Calibri" w:hAnsi="Calibri"/>
+          <w:color w:val="1C2428"/>
+          <w:sz w:val="21"/>
+        </w:rPr>
+        <w:t>música acústica o de baixa amplificació, recitals, poesia i narració oral;</w:t>
+      </w:r>
+    </w:p>
+    <w:p>
+      <w:pPr>
+        <w:keepLines/>
+        <w:numPr>
+          <w:ilvl w:val="0"/>
+          <w:numId w:val="10"/>
+        </w:numPr>
+        <w:spacing w:after="60" w:line="283" w:lineRule="auto"/>
+        <w:jc w:val="left"/>
+      </w:pPr>
+      <w:r>
+        <w:rPr>
+          <w:rFonts w:ascii="Calibri" w:hAnsi="Calibri"/>
+          <w:color w:val="1C2428"/>
+          <w:sz w:val="21"/>
+        </w:rPr>
+        <w:t>presentacions de llibres, projectes, recerques i iniciatives veïnals;</w:t>
+      </w:r>
+    </w:p>
+    <w:p>
+      <w:pPr>
+        <w:keepLines/>
+        <w:numPr>
+          <w:ilvl w:val="0"/>
+          <w:numId w:val="10"/>
+        </w:numPr>
+        <w:spacing w:after="60" w:line="283" w:lineRule="auto"/>
+        <w:jc w:val="left"/>
+      </w:pPr>
+      <w:r>
+        <w:rPr>
+          <w:rFonts w:ascii="Calibri" w:hAnsi="Calibri"/>
+          <w:color w:val="1C2428"/>
+          <w:sz w:val="21"/>
+        </w:rPr>
+        <w:t>arts visuals, instal·lacions temporals, fotografia, cinema de petit format i performance compatible;</w:t>
+      </w:r>
+    </w:p>
+    <w:p>
+      <w:pPr>
+        <w:keepLines/>
+        <w:numPr>
+          <w:ilvl w:val="0"/>
+          <w:numId w:val="10"/>
+        </w:numPr>
+        <w:spacing w:after="60" w:line="283" w:lineRule="auto"/>
+        <w:jc w:val="left"/>
+      </w:pPr>
+      <w:r>
+        <w:rPr>
+          <w:rFonts w:ascii="Calibri" w:hAnsi="Calibri"/>
+          <w:color w:val="1C2428"/>
+          <w:sz w:val="21"/>
+        </w:rPr>
+        <w:t>tallers artístics intergeneracionals i activitats amb escoles;</w:t>
+      </w:r>
+    </w:p>
+    <w:p>
+      <w:pPr>
+        <w:keepLines/>
+        <w:numPr>
+          <w:ilvl w:val="0"/>
+          <w:numId w:val="10"/>
+        </w:numPr>
+        <w:spacing w:after="60" w:line="283" w:lineRule="auto"/>
+        <w:jc w:val="left"/>
+      </w:pPr>
+      <w:r>
+        <w:rPr>
+          <w:rFonts w:ascii="Calibri" w:hAnsi="Calibri"/>
+          <w:color w:val="1C2428"/>
+          <w:sz w:val="21"/>
+        </w:rPr>
+        <w:t>residències curtes d’artistes, artesans o mediadors amb retorn públic;</w:t>
+      </w:r>
+    </w:p>
+    <w:p>
+      <w:pPr>
+        <w:keepLines/>
+        <w:numPr>
+          <w:ilvl w:val="0"/>
+          <w:numId w:val="10"/>
+        </w:numPr>
+        <w:spacing w:after="60" w:line="283" w:lineRule="auto"/>
+        <w:jc w:val="left"/>
+      </w:pPr>
+      <w:r>
+        <w:rPr>
+          <w:rFonts w:ascii="Calibri" w:hAnsi="Calibri"/>
+          <w:color w:val="1C2428"/>
+          <w:sz w:val="21"/>
+        </w:rPr>
+        <w:t>exposicions i mercats puntuals de peces produïdes dins els programes socials i circulars.</w:t>
+      </w:r>
+    </w:p>
+    <w:p>
+      <w:r>
+        <w:rPr>
+          <w:rFonts w:ascii="Calibri" w:hAnsi="Calibri"/>
+          <w:color w:val="1C2428"/>
+          <w:sz w:val="21"/>
+        </w:rPr>
+        <w:t>La prioritat serà el programa diürn o de primera hora del vespre, amb aforament limitat, calendari publicat, accessibilitat, mediació amb el veïnat i protocol de so. No es pressuposa una llicència permanent de sala ni una activitat nocturna. Cada acte es farà només amb l’autorització, assegurança, pla d’emergència, condicions acústiques i règim fiscal que corresponguin. Els ingressos podran provenir d’entrades o aportacions assequibles, contractació cultural, tallers, patrocinis de programa i barres o restauració només si existeix un operador i permís específics.</w:t>
+      </w:r>
+    </w:p>
+    <w:p>
+      <w:pPr>
+        <w:pStyle w:val="Heading2"/>
+        <w:keepNext/>
+      </w:pPr>
+      <w:r>
+        <w:rPr>
+          <w:rFonts w:ascii="Calibri" w:hAnsi="Calibri"/>
+          <w:b/>
+          <w:color w:val="245A7A"/>
+          <w:sz w:val="25"/>
+        </w:rPr>
+        <w:t>4.5 Taller circular i upcycling</w:t>
+      </w:r>
+    </w:p>
+    <w:p>
+      <w:r>
+        <w:rPr>
+          <w:rFonts w:ascii="Calibri" w:hAnsi="Calibri"/>
+          <w:color w:val="1C2428"/>
+          <w:sz w:val="21"/>
+        </w:rPr>
+        <w:t xml:space="preserve">El projecte incorporarà un petit laboratori de reparació, reutilització i </w:t>
+      </w:r>
+      <w:r>
+        <w:rPr>
+          <w:rFonts w:ascii="Calibri" w:hAnsi="Calibri"/>
+          <w:b/>
+          <w:color w:val="1C2428"/>
+          <w:sz w:val="21"/>
+        </w:rPr>
+        <w:t>upcycling</w:t>
+      </w:r>
+      <w:r>
+        <w:rPr>
+          <w:rFonts w:ascii="Calibri" w:hAnsi="Calibri"/>
+          <w:color w:val="1C2428"/>
+          <w:sz w:val="21"/>
+        </w:rPr>
+        <w:t xml:space="preserve"> per convertir materials nets recuperats en productes útils: jardineres, mobiliari lleuger, senyalètica, elements expositius, peces tèxtils, objectes artístics i kits educatius.</w:t>
+      </w:r>
+    </w:p>
+    <w:p>
+      <w:r>
+        <w:rPr>
+          <w:rFonts w:ascii="Calibri" w:hAnsi="Calibri"/>
+          <w:color w:val="1C2428"/>
+          <w:sz w:val="21"/>
+        </w:rPr>
+        <w:t>Es prioritzaran materials que encara siguin productes reutilitzables o que arribin a través de gestors i col·laboradors autoritzats. No s’acceptaran residus sanitaris, químics, elèctrics no revisats, fustes tractades desconegudes, materials amb amiant ni altres fluxos perillosos. Abans d’emmagatzemar o transformar materials que jurídicament siguin residus, es confirmarà amb l’Ajuntament o l’Agència de Residus el règim aplicable.</w:t>
+      </w:r>
+    </w:p>
+    <w:p>
+      <w:r>
+        <w:rPr>
+          <w:rFonts w:ascii="Calibri" w:hAnsi="Calibri"/>
+          <w:color w:val="1C2428"/>
+          <w:sz w:val="21"/>
+        </w:rPr>
+        <w:t>El programa combinarà tallers oberts, formació prelaboral, encàrrecs per a escoles i entitats, reparació d’elements del mateix jardí i venda transparent de sèries petites. Es registrarà l’origen dels materials, les unitats o quilograms recuperats, hores formatives, costos, productes, ingressos i destinació social del marge.</w:t>
+      </w:r>
+    </w:p>
+    <w:p>
+      <w:pPr>
+        <w:pStyle w:val="Heading2"/>
+        <w:keepNext/>
+      </w:pPr>
+      <w:r>
+        <w:rPr>
+          <w:rFonts w:ascii="Calibri" w:hAnsi="Calibri"/>
+          <w:b/>
+          <w:color w:val="245A7A"/>
+          <w:sz w:val="25"/>
+        </w:rPr>
+        <w:t>4.6 Responsabilitat social corporativa</w:t>
       </w:r>
     </w:p>
     <w:p>
@@ -1045,6 +1282,7 @@
     </w:p>
     <w:p>
       <w:pPr>
+        <w:keepLines/>
         <w:numPr>
           <w:ilvl w:val="0"/>
           <w:numId w:val="10"/>
@@ -1072,6 +1310,7 @@
     </w:p>
     <w:p>
       <w:pPr>
+        <w:keepLines/>
         <w:numPr>
           <w:ilvl w:val="0"/>
           <w:numId w:val="10"/>
@@ -1099,6 +1338,7 @@
     </w:p>
     <w:p>
       <w:pPr>
+        <w:keepLines/>
         <w:numPr>
           <w:ilvl w:val="0"/>
           <w:numId w:val="10"/>
@@ -1186,6 +1426,7 @@
     </w:p>
     <w:p>
       <w:pPr>
+        <w:keepLines/>
         <w:numPr>
           <w:ilvl w:val="0"/>
           <w:numId w:val="10"/>
@@ -1204,6 +1445,7 @@
     </w:p>
     <w:p>
       <w:pPr>
+        <w:keepLines/>
         <w:numPr>
           <w:ilvl w:val="0"/>
           <w:numId w:val="10"/>
@@ -1222,6 +1464,7 @@
     </w:p>
     <w:p>
       <w:pPr>
+        <w:keepLines/>
         <w:numPr>
           <w:ilvl w:val="0"/>
           <w:numId w:val="10"/>
@@ -1240,6 +1483,7 @@
     </w:p>
     <w:p>
       <w:pPr>
+        <w:keepLines/>
         <w:numPr>
           <w:ilvl w:val="0"/>
           <w:numId w:val="10"/>
@@ -1258,6 +1502,7 @@
     </w:p>
     <w:p>
       <w:pPr>
+        <w:keepLines/>
         <w:numPr>
           <w:ilvl w:val="0"/>
           <w:numId w:val="10"/>
@@ -1276,6 +1521,45 @@
     </w:p>
     <w:p>
       <w:pPr>
+        <w:keepLines/>
+        <w:numPr>
+          <w:ilvl w:val="0"/>
+          <w:numId w:val="10"/>
+        </w:numPr>
+        <w:spacing w:after="60" w:line="283" w:lineRule="auto"/>
+        <w:jc w:val="left"/>
+      </w:pPr>
+      <w:r>
+        <w:rPr>
+          <w:rFonts w:ascii="Calibri" w:hAnsi="Calibri"/>
+          <w:color w:val="1C2428"/>
+          <w:sz w:val="21"/>
+        </w:rPr>
+        <w:t>infraestructura bàsica per a presentacions i cultura de baixa intensitat;</w:t>
+      </w:r>
+    </w:p>
+    <w:p>
+      <w:pPr>
+        <w:keepLines/>
+        <w:numPr>
+          <w:ilvl w:val="0"/>
+          <w:numId w:val="10"/>
+        </w:numPr>
+        <w:spacing w:after="60" w:line="283" w:lineRule="auto"/>
+        <w:jc w:val="left"/>
+      </w:pPr>
+      <w:r>
+        <w:rPr>
+          <w:rFonts w:ascii="Calibri" w:hAnsi="Calibri"/>
+          <w:color w:val="1C2428"/>
+          <w:sz w:val="21"/>
+        </w:rPr>
+        <w:t>banc de treball i emmagatzematge separat per al taller circular;</w:t>
+      </w:r>
+    </w:p>
+    <w:p>
+      <w:pPr>
+        <w:keepLines/>
         <w:numPr>
           <w:ilvl w:val="0"/>
           <w:numId w:val="10"/>
@@ -1294,6 +1578,7 @@
     </w:p>
     <w:p>
       <w:pPr>
+        <w:keepLines/>
         <w:numPr>
           <w:ilvl w:val="0"/>
           <w:numId w:val="10"/>
@@ -1312,6 +1597,7 @@
     </w:p>
     <w:p>
       <w:pPr>
+        <w:keepLines/>
         <w:numPr>
           <w:ilvl w:val="0"/>
           <w:numId w:val="10"/>
@@ -1365,6 +1651,7 @@
     </w:p>
     <w:p>
       <w:pPr>
+        <w:keepLines/>
         <w:numPr>
           <w:ilvl w:val="0"/>
           <w:numId w:val="10"/>
@@ -1392,6 +1679,7 @@
     </w:p>
     <w:p>
       <w:pPr>
+        <w:keepLines/>
         <w:numPr>
           <w:ilvl w:val="0"/>
           <w:numId w:val="10"/>
@@ -1469,6 +1757,7 @@
     </w:p>
     <w:p>
       <w:pPr>
+        <w:keepLines/>
         <w:numPr>
           <w:ilvl w:val="0"/>
           <w:numId w:val="12"/>
@@ -1487,6 +1776,7 @@
     </w:p>
     <w:p>
       <w:pPr>
+        <w:keepLines/>
         <w:numPr>
           <w:ilvl w:val="0"/>
           <w:numId w:val="12"/>
@@ -1505,6 +1795,7 @@
     </w:p>
     <w:p>
       <w:pPr>
+        <w:keepLines/>
         <w:numPr>
           <w:ilvl w:val="0"/>
           <w:numId w:val="12"/>
@@ -1523,6 +1814,7 @@
     </w:p>
     <w:p>
       <w:pPr>
+        <w:keepLines/>
         <w:numPr>
           <w:ilvl w:val="0"/>
           <w:numId w:val="12"/>
@@ -1541,6 +1833,7 @@
     </w:p>
     <w:p>
       <w:pPr>
+        <w:keepLines/>
         <w:numPr>
           <w:ilvl w:val="0"/>
           <w:numId w:val="12"/>
@@ -1559,6 +1852,7 @@
     </w:p>
     <w:p>
       <w:pPr>
+        <w:keepLines/>
         <w:numPr>
           <w:ilvl w:val="0"/>
           <w:numId w:val="12"/>
@@ -1577,6 +1871,7 @@
     </w:p>
     <w:p>
       <w:pPr>
+        <w:keepLines/>
         <w:numPr>
           <w:ilvl w:val="0"/>
           <w:numId w:val="12"/>
@@ -1595,6 +1890,7 @@
     </w:p>
     <w:p>
       <w:pPr>
+        <w:keepLines/>
         <w:numPr>
           <w:ilvl w:val="0"/>
           <w:numId w:val="12"/>
@@ -1613,6 +1909,7 @@
     </w:p>
     <w:p>
       <w:pPr>
+        <w:keepLines/>
         <w:numPr>
           <w:ilvl w:val="0"/>
           <w:numId w:val="12"/>
@@ -2045,7 +2342,7 @@
                 <w:color w:val="1C2428"/>
                 <w:sz w:val="17"/>
               </w:rPr>
-              <w:t>Coordinació d’hort, clima i patrimoni</w:t>
+              <w:t>Coordinació d’hort, clima, cultura i circularitat</w:t>
             </w:r>
           </w:p>
         </w:tc>
@@ -2963,7 +3260,7 @@
                 <w:color w:val="1C2428"/>
                 <w:sz w:val="17"/>
               </w:rPr>
-              <w:t>Mobiliari, magatzem i equipament comunitari</w:t>
+              <w:t>Mobiliari, magatzem, equip cultural i taller circular</w:t>
             </w:r>
           </w:p>
         </w:tc>
@@ -3383,7 +3680,7 @@
                 <w:color w:val="1C2428"/>
                 <w:sz w:val="17"/>
               </w:rPr>
-              <w:t>Activitats, materials i mediació</w:t>
+              <w:t>Activitats socials, culturals, circulars i mediació</w:t>
             </w:r>
           </w:p>
         </w:tc>
@@ -4092,7 +4389,7 @@
                 <w:color w:val="1C2428"/>
                 <w:sz w:val="17"/>
               </w:rPr>
-              <w:t>Tallers, visites, formacions i cessió compatible</w:t>
+              <w:t>Tallers, visites, actes culturals, productes circulars i cessió compatible</w:t>
             </w:r>
           </w:p>
         </w:tc>
@@ -4176,7 +4473,7 @@
                 <w:color w:val="1C2428"/>
                 <w:sz w:val="17"/>
               </w:rPr>
-              <w:t>Contractes amb escoles i institucions culturals</w:t>
+              <w:t>Contractes amb escoles, artistes i institucions culturals</w:t>
             </w:r>
           </w:p>
         </w:tc>
@@ -4503,6 +4800,7 @@
     </w:p>
     <w:p>
       <w:pPr>
+        <w:keepLines/>
         <w:numPr>
           <w:ilvl w:val="0"/>
           <w:numId w:val="10"/>
@@ -4530,6 +4828,7 @@
     </w:p>
     <w:p>
       <w:pPr>
+        <w:keepLines/>
         <w:numPr>
           <w:ilvl w:val="0"/>
           <w:numId w:val="10"/>
@@ -4643,6 +4942,7 @@
     </w:p>
     <w:p>
       <w:pPr>
+        <w:keepLines/>
         <w:numPr>
           <w:ilvl w:val="0"/>
           <w:numId w:val="10"/>
@@ -4661,6 +4961,7 @@
     </w:p>
     <w:p>
       <w:pPr>
+        <w:keepLines/>
         <w:numPr>
           <w:ilvl w:val="0"/>
           <w:numId w:val="10"/>
@@ -4679,6 +4980,7 @@
     </w:p>
     <w:p>
       <w:pPr>
+        <w:keepLines/>
         <w:numPr>
           <w:ilvl w:val="0"/>
           <w:numId w:val="10"/>
@@ -4697,6 +4999,7 @@
     </w:p>
     <w:p>
       <w:pPr>
+        <w:keepLines/>
         <w:numPr>
           <w:ilvl w:val="0"/>
           <w:numId w:val="10"/>
@@ -4715,6 +5018,7 @@
     </w:p>
     <w:p>
       <w:pPr>
+        <w:keepLines/>
         <w:numPr>
           <w:ilvl w:val="0"/>
           <w:numId w:val="10"/>
@@ -4733,6 +5037,7 @@
     </w:p>
     <w:p>
       <w:pPr>
+        <w:keepLines/>
         <w:numPr>
           <w:ilvl w:val="0"/>
           <w:numId w:val="10"/>
@@ -4752,6 +5057,7 @@
     <w:p>
       <w:pPr>
         <w:pStyle w:val="Heading1"/>
+        <w:pageBreakBefore/>
         <w:keepNext/>
       </w:pPr>
       <w:r>
@@ -5329,6 +5635,7 @@
     </w:p>
     <w:p>
       <w:pPr>
+        <w:keepLines/>
         <w:numPr>
           <w:ilvl w:val="0"/>
           <w:numId w:val="10"/>
@@ -5347,6 +5654,7 @@
     </w:p>
     <w:p>
       <w:pPr>
+        <w:keepLines/>
         <w:numPr>
           <w:ilvl w:val="0"/>
           <w:numId w:val="10"/>
@@ -5365,6 +5673,7 @@
     </w:p>
     <w:p>
       <w:pPr>
+        <w:keepLines/>
         <w:numPr>
           <w:ilvl w:val="0"/>
           <w:numId w:val="10"/>
@@ -5383,6 +5692,45 @@
     </w:p>
     <w:p>
       <w:pPr>
+        <w:keepLines/>
+        <w:numPr>
+          <w:ilvl w:val="0"/>
+          <w:numId w:val="10"/>
+        </w:numPr>
+        <w:spacing w:after="60" w:line="283" w:lineRule="auto"/>
+        <w:jc w:val="left"/>
+      </w:pPr>
+      <w:r>
+        <w:rPr>
+          <w:rFonts w:ascii="Calibri" w:hAnsi="Calibri"/>
+          <w:color w:val="1C2428"/>
+          <w:sz w:val="21"/>
+        </w:rPr>
+        <w:t>almenys 12 actes culturals de petita escala amb control d’aforament, horari i so;</w:t>
+      </w:r>
+    </w:p>
+    <w:p>
+      <w:pPr>
+        <w:keepLines/>
+        <w:numPr>
+          <w:ilvl w:val="0"/>
+          <w:numId w:val="10"/>
+        </w:numPr>
+        <w:spacing w:after="60" w:line="283" w:lineRule="auto"/>
+        <w:jc w:val="left"/>
+      </w:pPr>
+      <w:r>
+        <w:rPr>
+          <w:rFonts w:ascii="Calibri" w:hAnsi="Calibri"/>
+          <w:color w:val="1C2428"/>
+          <w:sz w:val="21"/>
+        </w:rPr>
+        <w:t>almenys 18 tallers de reparació, reutilització o upcycling, amb materials recuperats registrats;</w:t>
+      </w:r>
+    </w:p>
+    <w:p>
+      <w:pPr>
+        <w:keepLines/>
         <w:numPr>
           <w:ilvl w:val="0"/>
           <w:numId w:val="10"/>
@@ -5401,6 +5749,7 @@
     </w:p>
     <w:p>
       <w:pPr>
+        <w:keepLines/>
         <w:numPr>
           <w:ilvl w:val="0"/>
           <w:numId w:val="10"/>
@@ -5419,6 +5768,7 @@
     </w:p>
     <w:p>
       <w:pPr>
+        <w:keepLines/>
         <w:numPr>
           <w:ilvl w:val="0"/>
           <w:numId w:val="10"/>
@@ -5437,6 +5787,7 @@
     </w:p>
     <w:p>
       <w:pPr>
+        <w:keepLines/>
         <w:numPr>
           <w:ilvl w:val="0"/>
           <w:numId w:val="10"/>
@@ -5455,6 +5806,7 @@
     </w:p>
     <w:p>
       <w:pPr>
+        <w:keepLines/>
         <w:numPr>
           <w:ilvl w:val="0"/>
           <w:numId w:val="10"/>
@@ -5473,6 +5825,7 @@
     </w:p>
     <w:p>
       <w:pPr>
+        <w:keepLines/>
         <w:numPr>
           <w:ilvl w:val="0"/>
           <w:numId w:val="10"/>
@@ -5492,6 +5845,7 @@
     <w:p>
       <w:pPr>
         <w:pStyle w:val="Heading1"/>
+        <w:pageBreakBefore/>
         <w:keepNext/>
       </w:pPr>
       <w:r>
@@ -5516,6 +5870,7 @@
     </w:p>
     <w:p>
       <w:pPr>
+        <w:keepLines/>
         <w:numPr>
           <w:ilvl w:val="0"/>
           <w:numId w:val="13"/>
@@ -5534,6 +5889,7 @@
     </w:p>
     <w:p>
       <w:pPr>
+        <w:keepLines/>
         <w:numPr>
           <w:ilvl w:val="0"/>
           <w:numId w:val="13"/>
@@ -5552,6 +5908,7 @@
     </w:p>
     <w:p>
       <w:pPr>
+        <w:keepLines/>
         <w:numPr>
           <w:ilvl w:val="0"/>
           <w:numId w:val="13"/>
@@ -5570,6 +5927,7 @@
     </w:p>
     <w:p>
       <w:pPr>
+        <w:keepLines/>
         <w:numPr>
           <w:ilvl w:val="0"/>
           <w:numId w:val="13"/>
@@ -5588,6 +5946,7 @@
     </w:p>
     <w:p>
       <w:pPr>
+        <w:keepLines/>
         <w:numPr>
           <w:ilvl w:val="0"/>
           <w:numId w:val="13"/>
@@ -5606,6 +5965,7 @@
     </w:p>
     <w:p>
       <w:pPr>
+        <w:keepLines/>
         <w:numPr>
           <w:ilvl w:val="0"/>
           <w:numId w:val="13"/>
@@ -5639,6 +5999,7 @@
     </w:p>
     <w:p>
       <w:pPr>
+        <w:keepLines/>
         <w:numPr>
           <w:ilvl w:val="0"/>
           <w:numId w:val="10"/>
@@ -5657,6 +6018,7 @@
     </w:p>
     <w:p>
       <w:pPr>
+        <w:keepLines/>
         <w:numPr>
           <w:ilvl w:val="0"/>
           <w:numId w:val="10"/>
@@ -5675,6 +6037,7 @@
     </w:p>
     <w:p>
       <w:pPr>
+        <w:keepLines/>
         <w:numPr>
           <w:ilvl w:val="0"/>
           <w:numId w:val="10"/>
@@ -5710,6 +6073,7 @@
     </w:p>
     <w:p>
       <w:pPr>
+        <w:keepLines/>
         <w:numPr>
           <w:ilvl w:val="0"/>
           <w:numId w:val="10"/>
@@ -5728,6 +6092,7 @@
     </w:p>
     <w:p>
       <w:pPr>
+        <w:keepLines/>
         <w:numPr>
           <w:ilvl w:val="0"/>
           <w:numId w:val="10"/>
@@ -5746,6 +6111,7 @@
     </w:p>
     <w:p>
       <w:pPr>
+        <w:keepLines/>
         <w:numPr>
           <w:ilvl w:val="0"/>
           <w:numId w:val="10"/>
@@ -5759,7 +6125,62 @@
           <w:color w:val="1C2428"/>
           <w:sz w:val="17"/>
         </w:rPr>
-        <w:t xml:space="preserve">Agència de Salut Pública de Barcelona, </w:t>
+        <w:t>Ajuntament de Barcelona, convocatòria general de subvencions 2026, àmbit de cultura i projectes artístics i culturals de districte.</w:t>
+      </w:r>
+    </w:p>
+    <w:p>
+      <w:pPr>
+        <w:keepLines/>
+        <w:numPr>
+          <w:ilvl w:val="0"/>
+          <w:numId w:val="10"/>
+        </w:numPr>
+        <w:spacing w:after="20" w:line="252" w:lineRule="auto"/>
+        <w:jc w:val="left"/>
+      </w:pPr>
+      <w:r>
+        <w:rPr>
+          <w:rFonts w:ascii="Calibri" w:hAnsi="Calibri"/>
+          <w:color w:val="1C2428"/>
+          <w:sz w:val="17"/>
+        </w:rPr>
+        <w:t xml:space="preserve">Ajuntament de Barcelona, </w:t>
+      </w:r>
+      <w:r>
+        <w:rPr>
+          <w:rFonts w:ascii="Calibri" w:hAnsi="Calibri"/>
+          <w:i/>
+          <w:color w:val="1C2428"/>
+          <w:sz w:val="17"/>
+        </w:rPr>
+        <w:t>Ordenança del medi ambient urbà</w:t>
+      </w:r>
+      <w:r>
+        <w:rPr>
+          <w:rFonts w:ascii="Calibri" w:hAnsi="Calibri"/>
+          <w:color w:val="1C2428"/>
+          <w:sz w:val="17"/>
+        </w:rPr>
+        <w:t>, títol III sobre contaminació acústica.</w:t>
+      </w:r>
+    </w:p>
+    <w:p>
+      <w:pPr>
+        <w:keepLines/>
+        <w:numPr>
+          <w:ilvl w:val="0"/>
+          <w:numId w:val="10"/>
+        </w:numPr>
+        <w:spacing w:after="20" w:line="252" w:lineRule="auto"/>
+        <w:jc w:val="left"/>
+      </w:pPr>
+      <w:r>
+        <w:rPr>
+          <w:rFonts w:ascii="Calibri" w:hAnsi="Calibri"/>
+          <w:color w:val="1C2428"/>
+          <w:sz w:val="17"/>
+        </w:rPr>
+        <w:t xml:space="preserve">Agència de Residus de Catalunya, </w:t>
       </w:r>
       <w:hyperlink r:id="rId12">
         <w:r>
@@ -5769,7 +6190,7 @@
             <w:sz w:val="17"/>
             <w:rFonts w:ascii="Calibri" w:hAnsi="Calibri"/>
           </w:rPr>
-          <w:t>Centres d’Atenció i Seguiment</w:t>
+          <w:t>Reutilització i preparació per a la reutilització</w:t>
         </w:r>
       </w:hyperlink>
       <w:r>
@@ -5783,6 +6204,7 @@
     </w:p>
     <w:p>
       <w:pPr>
+        <w:keepLines/>
         <w:numPr>
           <w:ilvl w:val="0"/>
           <w:numId w:val="10"/>
@@ -5806,6 +6228,44 @@
             <w:sz w:val="17"/>
             <w:rFonts w:ascii="Calibri" w:hAnsi="Calibri"/>
           </w:rPr>
+          <w:t>Centres d’Atenció i Seguiment</w:t>
+        </w:r>
+      </w:hyperlink>
+      <w:r>
+        <w:rPr>
+          <w:rFonts w:ascii="Calibri" w:hAnsi="Calibri"/>
+          <w:color w:val="1C2428"/>
+          <w:sz w:val="17"/>
+        </w:rPr>
+        <w:t>.</w:t>
+      </w:r>
+    </w:p>
+    <w:p>
+      <w:pPr>
+        <w:keepLines/>
+        <w:numPr>
+          <w:ilvl w:val="0"/>
+          <w:numId w:val="10"/>
+        </w:numPr>
+        <w:spacing w:after="20" w:line="252" w:lineRule="auto"/>
+        <w:jc w:val="left"/>
+      </w:pPr>
+      <w:r>
+        <w:rPr>
+          <w:rFonts w:ascii="Calibri" w:hAnsi="Calibri"/>
+          <w:color w:val="1C2428"/>
+          <w:sz w:val="17"/>
+        </w:rPr>
+        <w:t xml:space="preserve">Agència de Salut Pública de Barcelona, </w:t>
+      </w:r>
+      <w:hyperlink r:id="rId14">
+        <w:r>
+          <w:rPr>
+            <w:color w:val="245A7A"/>
+            <w:u w:val="single"/>
+            <w:sz w:val="17"/>
+            <w:rFonts w:ascii="Calibri" w:hAnsi="Calibri"/>
+          </w:rPr>
           <w:t>Pla d’Acció sobre Drogues i Addiccions 2025–2028</w:t>
         </w:r>
       </w:hyperlink>
@@ -5820,6 +6280,7 @@
     </w:p>
     <w:p>
       <w:pPr>
+        <w:keepLines/>
         <w:numPr>
           <w:ilvl w:val="0"/>
           <w:numId w:val="10"/>
@@ -5855,6 +6316,7 @@
     </w:p>
     <w:p>
       <w:pPr>
+        <w:keepLines/>
         <w:numPr>
           <w:ilvl w:val="0"/>
           <w:numId w:val="10"/>
@@ -5870,7 +6332,7 @@
         </w:rPr>
         <w:t xml:space="preserve">EIT Community New European Bauhaus, </w:t>
       </w:r>
-      <w:hyperlink r:id="rId14">
+      <w:hyperlink r:id="rId15">
         <w:r>
           <w:rPr>
             <w:color w:val="245A7A"/>
@@ -5892,6 +6354,7 @@
     </w:p>
     <w:p>
       <w:pPr>
+        <w:keepLines/>
         <w:numPr>
           <w:ilvl w:val="0"/>
           <w:numId w:val="10"/>
@@ -5907,7 +6370,7 @@
         </w:rPr>
         <w:t xml:space="preserve">Ministeri de Cultura, </w:t>
       </w:r>
-      <w:hyperlink r:id="rId15">
+      <w:hyperlink r:id="rId16">
         <w:r>
           <w:rPr>
             <w:color w:val="245A7A"/>
@@ -5929,6 +6392,7 @@
     </w:p>
     <w:p>
       <w:pPr>
+        <w:keepLines/>
         <w:numPr>
           <w:ilvl w:val="0"/>
           <w:numId w:val="10"/>
@@ -5944,7 +6408,7 @@
         </w:rPr>
         <w:t xml:space="preserve">Comissió Europea, </w:t>
       </w:r>
-      <w:hyperlink r:id="rId16">
+      <w:hyperlink r:id="rId17">
         <w:r>
           <w:rPr>
             <w:color w:val="245A7A"/>
@@ -5963,7 +6427,7 @@
         </w:rPr>
         <w:t xml:space="preserve"> i </w:t>
       </w:r>
-      <w:hyperlink r:id="rId17">
+      <w:hyperlink r:id="rId18">
         <w:r>
           <w:rPr>
             <w:color w:val="245A7A"/>

</xml_diff>